<commit_message>
Update login header and add academic docs
Replace the placeholder graduation-cap icon with the CPHR logo image and increase the logo size to 100x100; update the page title to 'CPHR KKU'. Add multiple academic document uploads under uploads/academic (new doc_1.docx files for ids 1,3,4,5,6) and update the existing uploads/academic/2/doc_1.docx.
</commit_message>
<xml_diff>
--- a/shopping-cart-spring-boot-main/uploads/academic/2/doc_1.docx
+++ b/shopping-cart-spring-boot-main/uploads/academic/2/doc_1.docx
@@ -485,7 +485,7 @@
                 <w:sz w:val="28"/>
                 <w:b w:val="off"/>
               </w:rPr>
-              <w:t>{{chk_app_1}}</w:t>
+              <w:t>☐</w:t>
             </w:r>
           </w:p>
         </w:tc>
@@ -509,7 +509,7 @@
                 <w:sz w:val="28"/>
                 <w:b w:val="off"/>
               </w:rPr>
-              <w:t>{{chk_off_1}}</w:t>
+              <w:t>☑</w:t>
             </w:r>
           </w:p>
         </w:tc>
@@ -533,7 +533,7 @@
                 <w:sz w:val="28"/>
                 <w:b w:val="off"/>
               </w:rPr>
-              <w:t>{{text_1}}</w:t>
+              <w:t>เัเี่</w:t>
             </w:r>
           </w:p>
         </w:tc>
@@ -636,7 +636,7 @@
                 <w:sz w:val="28"/>
                 <w:b w:val="off"/>
               </w:rPr>
-              <w:t>{{chk_app_2}}</w:t>
+              <w:t>☐</w:t>
             </w:r>
           </w:p>
         </w:tc>
@@ -660,7 +660,7 @@
                 <w:sz w:val="28"/>
                 <w:b w:val="off"/>
               </w:rPr>
-              <w:t>{{chk_off_2}}</w:t>
+              <w:t>☑</w:t>
             </w:r>
           </w:p>
         </w:tc>
@@ -684,7 +684,7 @@
                 <w:sz w:val="28"/>
                 <w:b w:val="off"/>
               </w:rPr>
-              <w:t>{{text_2}}</w:t>
+              <w:t/>
             </w:r>
           </w:p>
         </w:tc>
@@ -797,7 +797,7 @@
                 <w:sz w:val="28"/>
                 <w:b w:val="off"/>
               </w:rPr>
-              <w:t>{{chk_app_3}}</w:t>
+              <w:t>☑</w:t>
             </w:r>
           </w:p>
         </w:tc>
@@ -821,7 +821,7 @@
                 <w:sz w:val="28"/>
                 <w:b w:val="off"/>
               </w:rPr>
-              <w:t>{{chk_off_3}}</w:t>
+              <w:t>☑</w:t>
             </w:r>
           </w:p>
         </w:tc>
@@ -845,7 +845,7 @@
                 <w:sz w:val="28"/>
                 <w:b w:val="off"/>
               </w:rPr>
-              <w:t>{{text_3}}</w:t>
+              <w:t/>
             </w:r>
           </w:p>
         </w:tc>
@@ -968,7 +968,7 @@
                 <w:sz w:val="28"/>
                 <w:b w:val="off"/>
               </w:rPr>
-              <w:t>{{chk_app_4}}</w:t>
+              <w:t>☑</w:t>
             </w:r>
           </w:p>
         </w:tc>
@@ -992,7 +992,7 @@
                 <w:sz w:val="28"/>
                 <w:b w:val="off"/>
               </w:rPr>
-              <w:t>{{chk_off_4}}</w:t>
+              <w:t>☑</w:t>
             </w:r>
           </w:p>
         </w:tc>
@@ -1016,7 +1016,7 @@
                 <w:sz w:val="28"/>
                 <w:b w:val="off"/>
               </w:rPr>
-              <w:t>{{text_4}}</w:t>
+              <w:t/>
             </w:r>
           </w:p>
         </w:tc>
@@ -1119,7 +1119,7 @@
                 <w:sz w:val="28"/>
                 <w:b w:val="off"/>
               </w:rPr>
-              <w:t>{{chk_app_5}}</w:t>
+              <w:t>☑</w:t>
             </w:r>
           </w:p>
         </w:tc>
@@ -1143,7 +1143,7 @@
                 <w:sz w:val="28"/>
                 <w:b w:val="off"/>
               </w:rPr>
-              <w:t>{{chk_off_5}}</w:t>
+              <w:t>☑</w:t>
             </w:r>
           </w:p>
         </w:tc>
@@ -1167,7 +1167,7 @@
                 <w:sz w:val="28"/>
                 <w:b w:val="off"/>
               </w:rPr>
-              <w:t>{{text_5}}</w:t>
+              <w:t/>
             </w:r>
           </w:p>
         </w:tc>
@@ -1220,7 +1220,7 @@
           <w:sz w:val="32"/>
           <w:b w:val="off"/>
         </w:rPr>
-        <w:t xml:space="preserve">     ({{name_applicant}})				(นางสาวจิราภรณ์  หอมอ่อน)</w:t>
+        <w:t xml:space="preserve">     (หะพ้)				(นางสาวจิราภรณ์  หอมอ่อน)</w:t>
       </w:r>
     </w:p>
     <w:p>

</xml_diff>

<commit_message>
Implement admin user management, petitions & tests
Adds admin user-management and petition-status features: new specification docs (.kiro/specs), controller endpoints (AdminController, PetitionController), services (PetitionService, User-related service updates), models (Petition, PetitionStatus, StatusType), repositories, custom exceptions and GlobalExceptionHandler, DB migrations (Flyway SQL files), templates, static assets (CSS), file upload handling for profile images, audit logging integration, and extensive unit/property/integration tests. Also includes many resource additions (docx templates, uploads) and minor project settings updates to support real-time profile image updates, CRUD for users/admins, and petition status management.
</commit_message>
<xml_diff>
--- a/shopping-cart-spring-boot-main/uploads/academic/2/doc_1.docx
+++ b/shopping-cart-spring-boot-main/uploads/academic/2/doc_1.docx
@@ -80,14 +80,14 @@
     </w:p>
     <w:tbl>
       <w:tblPr>
-        <w:tblStyle w:val="TableGrid"/>
+        <w:tblStyle w:val="a3"/>
         <w:tblW w:w="0" w:type="auto"/>
         <w:tblLook w:val="04A0" w:firstRow="1" w:lastRow="0" w:firstColumn="1" w:lastColumn="0" w:noHBand="0" w:noVBand="1"/>
       </w:tblPr>
       <w:tblGrid>
-        <w:gridCol w:w="698"/>
-        <w:gridCol w:w="4314"/>
-        <w:gridCol w:w="738"/>
+        <w:gridCol w:w="702"/>
+        <w:gridCol w:w="4280"/>
+        <w:gridCol w:w="768"/>
         <w:gridCol w:w="1359"/>
         <w:gridCol w:w="1265"/>
         <w:gridCol w:w="976"/>
@@ -485,7 +485,7 @@
                 <w:sz w:val="28"/>
                 <w:b w:val="off"/>
               </w:rPr>
-              <w:t>☐</w:t>
+              <w:t/>
             </w:r>
           </w:p>
         </w:tc>
@@ -509,7 +509,7 @@
                 <w:sz w:val="28"/>
                 <w:b w:val="off"/>
               </w:rPr>
-              <w:t>☑</w:t>
+              <w:t>✓</w:t>
             </w:r>
           </w:p>
         </w:tc>
@@ -519,7 +519,6 @@
           </w:tcPr>
           <w:p>
             <w:pPr>
-              <w:jc w:val="center"/>
               <w:rPr>
                 <w:rFonts w:ascii="TH Sarabun New" w:hAnsi="TH Sarabun New" w:cs="TH Sarabun New"/>
                 <w:sz w:val="28"/>
@@ -533,7 +532,7 @@
                 <w:sz w:val="28"/>
                 <w:b w:val="off"/>
               </w:rPr>
-              <w:t>เัเี่</w:t>
+              <w:t/>
             </w:r>
           </w:p>
         </w:tc>
@@ -636,7 +635,7 @@
                 <w:sz w:val="28"/>
                 <w:b w:val="off"/>
               </w:rPr>
-              <w:t>☐</w:t>
+              <w:t/>
             </w:r>
           </w:p>
         </w:tc>
@@ -660,7 +659,7 @@
                 <w:sz w:val="28"/>
                 <w:b w:val="off"/>
               </w:rPr>
-              <w:t>☑</w:t>
+              <w:t>✓</w:t>
             </w:r>
           </w:p>
         </w:tc>
@@ -670,7 +669,6 @@
           </w:tcPr>
           <w:p>
             <w:pPr>
-              <w:jc w:val="center"/>
               <w:rPr>
                 <w:rFonts w:ascii="TH Sarabun New" w:hAnsi="TH Sarabun New" w:cs="TH Sarabun New"/>
                 <w:sz w:val="28"/>
@@ -797,7 +795,7 @@
                 <w:sz w:val="28"/>
                 <w:b w:val="off"/>
               </w:rPr>
-              <w:t>☑</w:t>
+              <w:t/>
             </w:r>
           </w:p>
         </w:tc>
@@ -821,7 +819,7 @@
                 <w:sz w:val="28"/>
                 <w:b w:val="off"/>
               </w:rPr>
-              <w:t>☑</w:t>
+              <w:t>✓</w:t>
             </w:r>
           </w:p>
         </w:tc>
@@ -831,7 +829,6 @@
           </w:tcPr>
           <w:p>
             <w:pPr>
-              <w:jc w:val="center"/>
               <w:rPr>
                 <w:rFonts w:ascii="TH Sarabun New" w:hAnsi="TH Sarabun New" w:cs="TH Sarabun New"/>
                 <w:sz w:val="28"/>
@@ -968,7 +965,7 @@
                 <w:sz w:val="28"/>
                 <w:b w:val="off"/>
               </w:rPr>
-              <w:t>☑</w:t>
+              <w:t/>
             </w:r>
           </w:p>
         </w:tc>
@@ -992,7 +989,7 @@
                 <w:sz w:val="28"/>
                 <w:b w:val="off"/>
               </w:rPr>
-              <w:t>☑</w:t>
+              <w:t>✓</w:t>
             </w:r>
           </w:p>
         </w:tc>
@@ -1002,7 +999,6 @@
           </w:tcPr>
           <w:p>
             <w:pPr>
-              <w:jc w:val="center"/>
               <w:rPr>
                 <w:rFonts w:ascii="TH Sarabun New" w:hAnsi="TH Sarabun New" w:cs="TH Sarabun New"/>
                 <w:sz w:val="28"/>
@@ -1119,7 +1115,7 @@
                 <w:sz w:val="28"/>
                 <w:b w:val="off"/>
               </w:rPr>
-              <w:t>☑</w:t>
+              <w:t/>
             </w:r>
           </w:p>
         </w:tc>
@@ -1143,7 +1139,7 @@
                 <w:sz w:val="28"/>
                 <w:b w:val="off"/>
               </w:rPr>
-              <w:t>☑</w:t>
+              <w:t>✓</w:t>
             </w:r>
           </w:p>
         </w:tc>
@@ -1153,7 +1149,6 @@
           </w:tcPr>
           <w:p>
             <w:pPr>
-              <w:jc w:val="center"/>
               <w:rPr>
                 <w:rFonts w:ascii="TH Sarabun New" w:hAnsi="TH Sarabun New" w:cs="TH Sarabun New"/>
                 <w:sz w:val="28"/>
@@ -1176,7 +1171,6 @@
     <w:p>
       <w:pPr>
         <w:spacing w:after="0"/>
-        <w:ind w:left="720" w:firstLine="720"/>
         <w:rPr>
           <w:rFonts w:ascii="TH Sarabun New" w:hAnsi="TH Sarabun New" w:cs="TH Sarabun New"/>
           <w:b/>
@@ -1190,7 +1184,6 @@
     <w:p>
       <w:pPr>
         <w:spacing w:after="0"/>
-        <w:ind w:left="720" w:firstLine="720"/>
         <w:rPr>
           <w:rFonts w:ascii="TH Sarabun New" w:hAnsi="TH Sarabun New" w:cs="TH Sarabun New"/>
           <w:b/>
@@ -1204,141 +1197,181 @@
     <w:p>
       <w:pPr>
         <w:spacing w:after="0"/>
-        <w:ind w:left="720" w:firstLine="720"/>
         <w:rPr>
           <w:rFonts w:ascii="TH Sarabun New" w:hAnsi="TH Sarabun New" w:cs="TH Sarabun New"/>
+          <w:b/>
+          <w:bCs/>
           <w:sz w:val="32"/>
           <w:szCs w:val="32"/>
           <w:lang w:bidi="th-TH"/>
         </w:rPr>
       </w:pPr>
-      <w:proofErr w:type="spellStart"/>
-      <w:proofErr w:type="spellEnd"/>
-      <w:r>
-        <w:rPr>
-          <w:rFonts w:ascii="TH Sarabun New" w:hAnsi="TH Sarabun New" w:cs="TH Sarabun New" w:eastAsia="TH Sarabun New"/>
-          <w:sz w:val="32"/>
-          <w:b w:val="off"/>
-        </w:rPr>
-        <w:t xml:space="preserve">     (หะพ้)				(นางสาวจิราภรณ์  หอมอ่อน)</w:t>
-      </w:r>
     </w:p>
-    <w:p>
-      <w:pPr>
-        <w:spacing w:after="0"/>
-        <w:ind w:left="720" w:firstLine="720"/>
-        <w:rPr>
-          <w:rFonts w:ascii="TH Sarabun New" w:hAnsi="TH Sarabun New" w:cs="TH Sarabun New"/>
-          <w:sz w:val="32"/>
-          <w:szCs w:val="32"/>
-          <w:lang w:bidi="th-TH"/>
-        </w:rPr>
-      </w:pPr>
-      <w:r>
-        <w:rPr>
-          <w:rFonts w:ascii="TH Sarabun New" w:hAnsi="TH Sarabun New" w:cs="TH Sarabun New" w:hint="cs"/>
-          <w:sz w:val="32"/>
-          <w:szCs w:val="32"/>
-          <w:cs/>
-          <w:lang w:bidi="th-TH"/>
-        </w:rPr>
-        <w:t xml:space="preserve"> </w:t>
-      </w:r>
-      <w:r>
-        <w:rPr>
-          <w:rFonts w:ascii="TH Sarabun New" w:hAnsi="TH Sarabun New" w:cs="TH Sarabun New" w:hint="cs"/>
-          <w:sz w:val="32"/>
-          <w:szCs w:val="32"/>
-          <w:cs/>
-          <w:lang w:bidi="th-TH"/>
-        </w:rPr>
-        <w:t>ผู้ขอ</w:t>
-      </w:r>
-      <w:r>
-        <w:rPr>
-          <w:rFonts w:ascii="TH Sarabun New" w:hAnsi="TH Sarabun New" w:cs="TH Sarabun New" w:hint="cs"/>
-          <w:sz w:val="32"/>
-          <w:szCs w:val="32"/>
-          <w:cs/>
-          <w:lang w:bidi="th-TH"/>
-        </w:rPr>
-        <w:t>รับการ</w:t>
-      </w:r>
-      <w:r>
-        <w:rPr>
-          <w:rFonts w:ascii="TH Sarabun New" w:hAnsi="TH Sarabun New" w:cs="TH Sarabun New" w:hint="cs"/>
-          <w:sz w:val="32"/>
-          <w:szCs w:val="32"/>
-          <w:cs/>
-          <w:lang w:bidi="th-TH"/>
-        </w:rPr>
-        <w:t>ประเมินผลการสอน</w:t>
-      </w:r>
-      <w:r>
-        <w:rPr>
-          <w:rFonts w:ascii="TH Sarabun New" w:hAnsi="TH Sarabun New" w:cs="TH Sarabun New"/>
-          <w:sz w:val="32"/>
-          <w:szCs w:val="32"/>
-          <w:cs/>
-          <w:lang w:bidi="th-TH"/>
-        </w:rPr>
-        <w:tab/>
-      </w:r>
-      <w:r>
-        <w:rPr>
-          <w:rFonts w:ascii="TH Sarabun New" w:hAnsi="TH Sarabun New" w:cs="TH Sarabun New"/>
-          <w:sz w:val="32"/>
-          <w:szCs w:val="32"/>
-          <w:cs/>
-          <w:lang w:bidi="th-TH"/>
-        </w:rPr>
-        <w:tab/>
-      </w:r>
-      <w:r>
-        <w:rPr>
-          <w:rFonts w:ascii="TH Sarabun New" w:hAnsi="TH Sarabun New" w:cs="TH Sarabun New"/>
-          <w:sz w:val="32"/>
-          <w:szCs w:val="32"/>
-          <w:cs/>
-          <w:lang w:bidi="th-TH"/>
-        </w:rPr>
-        <w:tab/>
-      </w:r>
-      <w:r>
-        <w:rPr>
-          <w:rFonts w:ascii="TH Sarabun New" w:hAnsi="TH Sarabun New" w:cs="TH Sarabun New"/>
-          <w:sz w:val="32"/>
-          <w:szCs w:val="32"/>
-          <w:cs/>
-          <w:lang w:bidi="th-TH"/>
-        </w:rPr>
-        <w:tab/>
-      </w:r>
-      <w:r>
-        <w:rPr>
-          <w:rFonts w:ascii="TH Sarabun New" w:hAnsi="TH Sarabun New" w:cs="TH Sarabun New" w:hint="cs"/>
-          <w:sz w:val="32"/>
-          <w:szCs w:val="32"/>
-          <w:cs/>
-          <w:lang w:bidi="th-TH"/>
-        </w:rPr>
-        <w:t xml:space="preserve">       </w:t>
-      </w:r>
-      <w:r>
-        <w:rPr>
-          <w:rFonts w:ascii="TH Sarabun New" w:hAnsi="TH Sarabun New" w:cs="TH Sarabun New" w:hint="cs"/>
-          <w:sz w:val="32"/>
-          <w:szCs w:val="32"/>
-          <w:cs/>
-          <w:lang w:bidi="th-TH"/>
-        </w:rPr>
-        <w:t xml:space="preserve">นักทรัพยากรบุคคล </w:t>
-      </w:r>
-    </w:p>
+    <w:tbl>
+      <w:tblPr>
+        <w:tblStyle w:val="a3"/>
+        <w:tblW w:w="0" w:type="auto"/>
+        <w:jc w:val="center"/>
+        <w:tblBorders>
+          <w:top w:val="none" w:sz="0" w:space="0" w:color="auto"/>
+          <w:left w:val="none" w:sz="0" w:space="0" w:color="auto"/>
+          <w:bottom w:val="none" w:sz="0" w:space="0" w:color="auto"/>
+          <w:right w:val="none" w:sz="0" w:space="0" w:color="auto"/>
+          <w:insideH w:val="none" w:sz="0" w:space="0" w:color="auto"/>
+          <w:insideV w:val="none" w:sz="0" w:space="0" w:color="auto"/>
+        </w:tblBorders>
+        <w:tblLook w:val="04A0" w:firstRow="1" w:lastRow="0" w:firstColumn="1" w:lastColumn="0" w:noHBand="0" w:noVBand="1"/>
+      </w:tblPr>
+      <w:tblGrid>
+        <w:gridCol w:w="4962"/>
+        <w:gridCol w:w="4393"/>
+      </w:tblGrid>
+      <w:tr>
+        <w:trPr>
+          <w:jc w:val="center"/>
+        </w:trPr>
+        <w:tc>
+          <w:tcPr>
+            <w:tcW w:w="4962" w:type="dxa"/>
+          </w:tcPr>
+          <w:p>
+            <w:pPr>
+              <w:jc w:val="center"/>
+              <w:rPr>
+                <w:rFonts w:ascii="TH Sarabun New" w:hAnsi="TH Sarabun New" w:cs="TH Sarabun New"/>
+                <w:b/>
+                <w:bCs/>
+                <w:sz w:val="32"/>
+                <w:szCs w:val="32"/>
+                <w:lang w:bidi="th-TH"/>
+              </w:rPr>
+            </w:pPr>
+            <w:proofErr w:type="spellStart"/>
+            <w:proofErr w:type="spellEnd"/>
+            <w:r>
+              <w:rPr>
+                <w:rFonts w:ascii="TH Sarabun New" w:hAnsi="TH Sarabun New" w:cs="TH Sarabun New" w:eastAsia="TH Sarabun New"/>
+                <w:sz w:val="32"/>
+                <w:b w:val="off"/>
+              </w:rPr>
+              <w:t>()</w:t>
+            </w:r>
+          </w:p>
+        </w:tc>
+        <w:tc>
+          <w:tcPr>
+            <w:tcW w:w="4393" w:type="dxa"/>
+          </w:tcPr>
+          <w:p>
+            <w:pPr>
+              <w:jc w:val="center"/>
+              <w:rPr>
+                <w:rFonts w:ascii="TH Sarabun New" w:hAnsi="TH Sarabun New" w:cs="TH Sarabun New"/>
+                <w:b/>
+                <w:bCs/>
+                <w:sz w:val="32"/>
+                <w:szCs w:val="32"/>
+                <w:lang w:bidi="th-TH"/>
+              </w:rPr>
+            </w:pPr>
+            <w:r>
+              <w:rPr>
+                <w:rFonts w:ascii="TH Sarabun New" w:hAnsi="TH Sarabun New" w:cs="TH Sarabun New" w:hint="cs"/>
+                <w:sz w:val="32"/>
+                <w:szCs w:val="32"/>
+                <w:cs/>
+                <w:lang w:bidi="th-TH"/>
+              </w:rPr>
+              <w:t>(นางสาวจิราภรณ์  หอมอ่อน)</w:t>
+            </w:r>
+          </w:p>
+        </w:tc>
+      </w:tr>
+      <w:tr>
+        <w:trPr>
+          <w:jc w:val="center"/>
+        </w:trPr>
+        <w:tc>
+          <w:tcPr>
+            <w:tcW w:w="4962" w:type="dxa"/>
+          </w:tcPr>
+          <w:p>
+            <w:pPr>
+              <w:jc w:val="center"/>
+              <w:rPr>
+                <w:rFonts w:ascii="TH Sarabun New" w:hAnsi="TH Sarabun New" w:cs="TH Sarabun New"/>
+                <w:b/>
+                <w:bCs/>
+                <w:sz w:val="32"/>
+                <w:szCs w:val="32"/>
+                <w:lang w:bidi="th-TH"/>
+              </w:rPr>
+            </w:pPr>
+            <w:r>
+              <w:rPr>
+                <w:rFonts w:ascii="TH Sarabun New" w:hAnsi="TH Sarabun New" w:cs="TH Sarabun New" w:hint="cs"/>
+                <w:sz w:val="32"/>
+                <w:szCs w:val="32"/>
+                <w:cs/>
+                <w:lang w:bidi="th-TH"/>
+              </w:rPr>
+              <w:t>ผู้ขอ</w:t>
+            </w:r>
+            <w:r>
+              <w:rPr>
+                <w:rFonts w:ascii="TH Sarabun New" w:hAnsi="TH Sarabun New" w:cs="TH Sarabun New" w:hint="cs"/>
+                <w:sz w:val="32"/>
+                <w:szCs w:val="32"/>
+                <w:cs/>
+                <w:lang w:bidi="th-TH"/>
+              </w:rPr>
+              <w:t>รับการ</w:t>
+            </w:r>
+            <w:r>
+              <w:rPr>
+                <w:rFonts w:ascii="TH Sarabun New" w:hAnsi="TH Sarabun New" w:cs="TH Sarabun New" w:hint="cs"/>
+                <w:sz w:val="32"/>
+                <w:szCs w:val="32"/>
+                <w:cs/>
+                <w:lang w:bidi="th-TH"/>
+              </w:rPr>
+              <w:t>ประเมินผลการสอน</w:t>
+            </w:r>
+          </w:p>
+        </w:tc>
+        <w:tc>
+          <w:tcPr>
+            <w:tcW w:w="4393" w:type="dxa"/>
+          </w:tcPr>
+          <w:p>
+            <w:pPr>
+              <w:jc w:val="center"/>
+              <w:rPr>
+                <w:rFonts w:ascii="TH Sarabun New" w:hAnsi="TH Sarabun New" w:cs="TH Sarabun New"/>
+                <w:b/>
+                <w:bCs/>
+                <w:sz w:val="32"/>
+                <w:szCs w:val="32"/>
+                <w:lang w:bidi="th-TH"/>
+              </w:rPr>
+            </w:pPr>
+            <w:r>
+              <w:rPr>
+                <w:rFonts w:ascii="TH Sarabun New" w:hAnsi="TH Sarabun New" w:cs="TH Sarabun New" w:hint="cs"/>
+                <w:sz w:val="32"/>
+                <w:szCs w:val="32"/>
+                <w:cs/>
+                <w:lang w:bidi="th-TH"/>
+              </w:rPr>
+              <w:t>นักทรัพยากรบุคคล</w:t>
+            </w:r>
+          </w:p>
+        </w:tc>
+      </w:tr>
+    </w:tbl>
     <w:p>
       <w:pPr>
         <w:rPr>
-          <w:rFonts w:hint="cs"/>
           <w:sz w:val="28"/>
           <w:szCs w:val="28"/>
           <w:cs/>
@@ -1751,16 +1784,17 @@
     <w:lsdException w:name="Unresolved Mention" w:semiHidden="1" w:unhideWhenUsed="1"/>
     <w:lsdException w:name="Smart Link" w:semiHidden="1" w:unhideWhenUsed="1"/>
   </w:latentStyles>
-  <w:style w:type="paragraph" w:default="1" w:styleId="Normal">
+  <w:style w:type="paragraph" w:default="1" w:styleId="a">
     <w:name w:val="Normal"/>
     <w:qFormat/>
   </w:style>
-  <w:style w:type="character" w:default="1" w:styleId="DefaultParagraphFont">
+  <w:style w:type="character" w:default="1" w:styleId="a0">
     <w:name w:val="Default Paragraph Font"/>
     <w:uiPriority w:val="1"/>
+    <w:semiHidden/>
     <w:unhideWhenUsed/>
   </w:style>
-  <w:style w:type="table" w:default="1" w:styleId="TableNormal">
+  <w:style w:type="table" w:default="1" w:styleId="a1">
     <w:name w:val="Normal Table"/>
     <w:uiPriority w:val="99"/>
     <w:semiHidden/>
@@ -1775,15 +1809,15 @@
       </w:tblCellMar>
     </w:tblPr>
   </w:style>
-  <w:style w:type="numbering" w:default="1" w:styleId="NoList">
+  <w:style w:type="numbering" w:default="1" w:styleId="a2">
     <w:name w:val="No List"/>
     <w:uiPriority w:val="99"/>
     <w:semiHidden/>
     <w:unhideWhenUsed/>
   </w:style>
-  <w:style w:type="table" w:styleId="TableGrid">
+  <w:style w:type="table" w:styleId="a3">
     <w:name w:val="Table Grid"/>
-    <w:basedOn w:val="TableNormal"/>
+    <w:basedOn w:val="a1"/>
     <w:uiPriority w:val="39"/>
     <w:rsid w:val="002B4E33"/>
     <w:pPr>

</xml_diff>